<commit_message>
Implement native GROMACS continuous simulated annealing (0K->300K in 1ns) heating protocol in 2_heat.mdp, add end-to-end pipeline scripts run_pipeline_all.ps1/.sh, and update SCI Methods documentation
Co-authored-by: arena-agent <297053741+arena-agent@users.noreply.github.com>
</commit_message>
<xml_diff>
--- a/gromacs_md/SCI_Methods_GROMACS_MD_Simulation.docx
+++ b/gromacs_md/SCI_Methods_GROMACS_MD_Simulation.docx
@@ -82,11 +82,11 @@
         <w:br/>
         <w:t>（1）能量最小化（Energy Minimization, EM）：使用最速下降法（Steepest Descents, integrator=steep）在对所有蛋白质和肽的重原子施加位置约束（define = -DPOSRES，力常数 k = 3 kcal·mol-1·Å-2 = 1255 kJ·mol-1·nm-2）的前提下进行 2,000 步能量优化，或至最大原子受力 Fmax &lt; 1,000 kJ·mol-1·nm-1 为止，消除空间位阻冲突。</w:t>
         <w:br/>
-        <w:t>（2）NVT 升温模拟（0 K 至 300 K，总时长 1.0 ns）：为避免低温骤升导致系统动能震荡，将 1.0 ns 的 NVT 加热过程划分成 5 个连续的等时分段（100 K -&gt; 150 K -&gt; 200 K -&gt; 250 K -&gt; 300 K，每个梯度温段运行 0.2 ns，即 100,000 步）。升温阶段全程对所有重原子保留 1255 kJ·mol-1·nm-2 的位置约束，温度耦合器采用 Velocity-rescale（v-rescale，作为 Langevin 热浴在 Gromacs 中的等效算法），为“蛋白质+肽”（Protein）与“水和离子”（Water_and_ions）两个独立热浴组分别设置时间常数 τ_T = 1.0 ps。</w:t>
+        <w:t>（2）NVT 升温模拟（0 K 至 300 K，总时长 1.0 ns）：采用 GROMACS 原生模拟退火（Simulated Annealing，annealing = single single）实现 1.0 ns 内自极低温（10 K）至 300 K 的连续线性加温，严格按照文献要求在1 ns内升至300 K。升温阶段全程对所有重原子保留 1255 kJ·mol-1·nm-2 的位置约束，温度耦合器采用 Velocity-rescale（v-rescale，作为 Langevin 热浴在 Gromacs 中的等效算法），为“蛋白质+肽”（Protein）与“水和离子”（Water_and_ions）两个独立热浴组分别设置时间常数 τ_T = 1.0 ps。</w:t>
         <w:br/>
-        <w:t>（3）NPT 恒压密度平衡（1.0 ns，重原子约束）：继续对重原子保留上述位置约束，在 300 K 和 1.0 bar 压力下运行 1.0 ns（500,000 步）NPT 模拟。控压采用 Berendsen 压力耦合器（isotropic 各向同性，τ_P = 2.0 ps，压缩率 4.5e-5 bar-1）。</w:t>
+        <w:t>（3）NPT 恒压密度平衡（1.0 ns，重原子约束）：继续对重原子保留上述位置约束，在 300 K 和 1.0 bar 压力下运行 1.0 ns（500,000 步）NPT 模拟。控压采用 Berendsen 压力耦合器（isotropic 各向同性，τ_P = 5.0 ps，压缩率 4.5e-5 bar-1）。</w:t>
         <w:br/>
-        <w:t>（4）NPT 无约束预平衡（1.0 ns）：释放全体系所有位置约束（define = -DFLEXIBLE），在恒定 300 K、1.0 bar 条件下继续运行 1.0 ns 无约束预平衡，促使肽与 AChE 界面侧链及周围显式水网络充分适应其近邻局部构象。</w:t>
+        <w:t>（4）NPT 无约束预平衡（1.0 ns）：释放全体系所有位置约束（define = -DFLEXIBLE），在恒定 300 K、1.0 bar 条件下继续运行 1.0 ns 无约束预平衡（τ_P = 5.0 ps 保证密度平衡平稳消警），促使肽与 AChE 界面侧链及显式水网络充分适应其近邻局部构象。</w:t>
       </w:r>
     </w:p>
     <w:p>
@@ -282,7 +282,7 @@
           </w:tcPr>
           <w:p>
             <w:r>
-              <w:t>2. NVT 梯度加热</w:t>
+              <w:t>2. NVT 连续退火升温</w:t>
             </w:r>
           </w:p>
         </w:tc>
@@ -292,7 +292,7 @@
           </w:tcPr>
           <w:p>
             <w:r>
-              <w:t>1.0 ns (100,000 步x5)</w:t>
+              <w:t>1.0 ns (500,000 步)</w:t>
             </w:r>
           </w:p>
         </w:tc>
@@ -322,7 +322,7 @@
           </w:tcPr>
           <w:p>
             <w:r>
-              <w:t>v-rescale 控温 (50-&gt;300 K 阶梯)</w:t>
+              <w:t>模拟退火 (0-&gt;300 K 连续线性升温)</w:t>
             </w:r>
           </w:p>
         </w:tc>
@@ -374,7 +374,7 @@
           </w:tcPr>
           <w:p>
             <w:r>
-              <w:t>v-rescale (300K) / Berendsen (1 bar)</w:t>
+              <w:t>v-rescale (300K) / Berendsen (tau_P=5.0 ps)</w:t>
             </w:r>
           </w:p>
         </w:tc>
@@ -426,7 +426,7 @@
           </w:tcPr>
           <w:p>
             <w:r>
-              <w:t>v-rescale (300K) / Berendsen (1 bar)</w:t>
+              <w:t>v-rescale (300K) / Berendsen (tau_P=5.0 ps)</w:t>
             </w:r>
           </w:p>
         </w:tc>
@@ -478,7 +478,7 @@
           </w:tcPr>
           <w:p>
             <w:r>
-              <w:t>v-rescale (300K) / Berendsen/PR (1 bar)</w:t>
+              <w:t>v-rescale (300K) / Berendsen/PR (tau_P=5.0 ps)</w:t>
             </w:r>
           </w:p>
         </w:tc>

</xml_diff>